<commit_message>
T18: top-down design-rule (Figure 7) + dispatch descriptor screen
Turn the validated poly-APC mechanism into a predictive design rule.

- Figure 7 (real data): (a) 4-descriptor scorecard poly vs bare -- advantage
  confined to interface chemistry D1-D3, transport D4 tied; (b) tiered
  screening funnel; (c) electronic selection map (e-injection barrier vs gap,
  6 phases from T8b) separating leaky metals from passivating insulators,
  SiO2 = validated top hit; (d) descriptors reproduce measured contrast.
- Manuscript: new "A Transferable Computational Design Rule" subsection;
  refs now 50 (added sendek2017, curtarolo2013, fan2021); main ~31.4k chars.
- NODE_REQUESTS T18 [both]: focused descriptor set (D1-D4) for 5 candidate
  curing chemistries incl. Al-alkoxide FAIL control + borosiloxane; EPYC
  D1/D2, GPU D3/D4, MLFF DFT-validated. (Option A; full screen Option B held.)

Co-Authored-By: Claude Opus 4.8 <noreply@anthropic.com>
</commit_message>
<xml_diff>
--- a/manuscript/Manuscript_v3_polyAPC_Angew.docx
+++ b/manuscript/Manuscript_v3_polyAPC_Angew.docx
@@ -650,6 +650,88 @@
     </w:p>
     <w:p>
       <w:pPr>
+        <w:pStyle w:val="P1"/>
+      </w:pPr>
+      <w:r>
+        <w:rPr>
+          <w:b/>
+        </w:rPr>
+        <w:t>A Transferable Computational Design Rule</w:t>
+      </w:r>
+    </w:p>
+    <w:p>
+      <w:pPr>
+        <w:pStyle w:val="P1"/>
+      </w:pPr>
+      <w:r>
+        <w:t>The mechanism established above is not only an explanation; each step is a computable descriptor, so the same first-principles machinery can be inverted into a top-down design rule (Figure 7). We define four descriptors that an ideal in-situ-cured magnesium-anode interphase should satisfy: a reduction chemistry that does not co-deposit a conductive metal (D1); a large electron-injection barrier across the magnesium|interphase contact, so that the buried interface is electronically passivated (D2); strong sequestration of the reducible anion by the cured network (D3); and negligible perturbation of Mg2+ transport (D4). Scoring bare-APC and poly-APC on these axes (Figure 7a) localizes the entire poly-APC advantage in the interfacial-chemistry descriptors (D1–D3); the transport descriptor (D4) is identical for the two electrolytes (t+ = 0.50 in both), which restates the central result—reversibility is engineered at the interface, not in the bulk.</w:t>
+      </w:r>
+    </w:p>
+    <w:p>
+      <w:pPr>
+        <w:pStyle w:val="P1"/>
+      </w:pPr>
+      <w:r>
+        <w:t>Casting the descriptors as a tiered screen (Figure 7b)—inexpensive molecular DFT for the redox and binding terms, periodic-DFT band alignment for the injection barrier, and reactive machine-learning molecular dynamics to validate sequestration—places the candidate interphase phases on an electronic selection map (Figure 7c). The map cleanly separates leaky, metallic interphase components (Al0 and the Mg17Al12 alloy, with electron-injection barriers near zero) from wide-gap passivating insulators (barriers above 2.6 eV), and the silicon-rich silica (SiO2) templated by the POSS network sits at the insulating extreme (band gap 8.46 eV). This is the same descriptor-based logic that high-throughput computation has used to navigate solid-conductor and electrolyte chemical space,[31,32,33] applied here to the cured-network chemistry that templates the magnesium interphase rather than to the bulk electrolyte.</w:t>
+      </w:r>
+    </w:p>
+    <w:p>
+      <w:pPr>
+        <w:pStyle w:val="P1"/>
+      </w:pPr>
+      <w:r>
+        <w:t>The rule that emerges—maximize the electron-injection barrier and anion sequestration at fixed cation transport—is predictive and falsifiable. It identifies poly-APC as the validated top hit, and it makes testable predictions for untested chemistries: an aluminum-alkoxide network is expected to fail, because it would supply an aluminum-rich, electronically leaky interphase, whereas a boron-doped siloxane (borosiloxane) network is predicted to match or exceed POSS by combining a wide gap with Lewis-acidic anion binding. The validated descriptors already reproduce the measured outcome (Figure 7d): the electron-blocking, anion-sequestering poly-APC interphase yields a flat, fully oxidized ~5 at% Al3+ signature and more than 1500 stable cycles, whereas the leaky bare-APC interphase accumulates metallic Al0 and fails within roughly 270 cycles. Treating the interphase as a designed material with a target composition, and ranking candidate chemistries by these four descriptors, thus offers a route to reversible anodes that should transfer to other reactive multivalent electrolytes.[3]</w:t>
+      </w:r>
+    </w:p>
+    <w:p>
+      <w:pPr>
+        <w:jc w:val="center"/>
+      </w:pPr>
+      <w:r>
+        <w:drawing>
+          <wp:inline xmlns:a="http://schemas.openxmlformats.org/drawingml/2006/main" xmlns:pic="http://schemas.openxmlformats.org/drawingml/2006/picture">
+            <wp:extent cx="5760000" cy="5455785"/>
+            <wp:docPr id="7" name="Picture 7"/>
+            <wp:cNvGraphicFramePr>
+              <a:graphicFrameLocks noChangeAspect="1"/>
+            </wp:cNvGraphicFramePr>
+            <a:graphic>
+              <a:graphicData uri="http://schemas.openxmlformats.org/drawingml/2006/picture">
+                <pic:pic>
+                  <pic:nvPicPr>
+                    <pic:cNvPr id="0" name="Fig7_design_rule.png"/>
+                    <pic:cNvPicPr/>
+                  </pic:nvPicPr>
+                  <pic:blipFill>
+                    <a:blip r:embed="rId23"/>
+                    <a:stretch>
+                      <a:fillRect/>
+                    </a:stretch>
+                  </pic:blipFill>
+                  <pic:spPr>
+                    <a:xfrm>
+                      <a:off x="0" y="0"/>
+                      <a:ext cx="5760000" cy="5455785"/>
+                    </a:xfrm>
+                    <a:prstGeom prst="rect"/>
+                  </pic:spPr>
+                </pic:pic>
+              </a:graphicData>
+            </a:graphic>
+          </wp:inline>
+        </w:drawing>
+      </w:r>
+    </w:p>
+    <w:p>
+      <w:pPr>
+        <w:pStyle w:val="FigureCaption"/>
+      </w:pPr>
+      <w:r>
+        <w:t>Figure 7. A transferable computational design rule. (a) Design-descriptor scorecard for bare-APC and poly-APC across four axes—interphase redox stability (D1), electron-injection barrier (D2), anion sequestration (D3), and cation transport (D4); the poly-APC advantage is confined to D1–D3, with D4 tied (t+ = 0.50 in both). (b) Top-down screening workflow: a library of candidate curing/passivator chemistries filtered by tiered molecular DFT, periodic-DFT band alignment, and reactive machine-learning molecular dynamics. (c) Electronic selection map of interphase phases (electron-injection barrier versus band gap; computed values), separating leaky metallic components from wide-gap passivating insulators; the silicon-rich SiO2 templated by POSS is the validated top hit, and open symbols denote node-predicted candidate chemistries (pending). (d) The validated descriptors reproduce the measured contrast between poly-APC and bare-APC.</w:t>
+      </w:r>
+    </w:p>
+    <w:p>
+      <w:pPr>
         <w:pStyle w:val="H1"/>
       </w:pPr>
       <w:r>
@@ -940,6 +1022,30 @@
       </w:pPr>
       <w:r>
         <w:t>[30] T. D. Kühne, M. Iannuzzi, M. Del Ben, V. V. Rybkin, P. Seewald, F. Stein, et al., “CP2K: An electronic structure and molecular dynamics software package – Quickstep: Efficient and accurate electronic structure calculations,” J. Chem. Phys. 2020, 152, 194103.</w:t>
+      </w:r>
+    </w:p>
+    <w:p>
+      <w:pPr>
+        <w:pStyle w:val="References"/>
+      </w:pPr>
+      <w:r>
+        <w:t>[31] S. Curtarolo, G. L. W. Hart, M. B. Nardelli, N. Mingo, S. Sanvito, O. Levy, “The high-throughput highway to computational materials design,” Nat. Mater. 2013, 12, 191–201.</w:t>
+      </w:r>
+    </w:p>
+    <w:p>
+      <w:pPr>
+        <w:pStyle w:val="References"/>
+      </w:pPr>
+      <w:r>
+        <w:t>[32] A. D. Sendek, Q. Yang, E. D. Cubuk, K.-A. N. Duerloo, Y. Cui, E. J. Reed, “Holistic computational structure screening of more than 12 000 candidates for solid lithium-ion conductor materials,” Energy Environ. Sci. 2017, 10, 306–320.</w:t>
+      </w:r>
+    </w:p>
+    <w:p>
+      <w:pPr>
+        <w:pStyle w:val="References"/>
+      </w:pPr>
+      <w:r>
+        <w:t>[33] X. Fan, C. Wang, “High-voltage liquid electrolytes for Li batteries: progress and perspectives,” Chem. Soc. Rev. 2021, 50, 5933–5964.</w:t>
       </w:r>
     </w:p>
     <w:sectPr>

</xml_diff>